<commit_message>
Revert Queue permissions made product-agnostic (PO instruction)
- SC5 composite: single View Application / Evaluate Application entries, no [Credit Card]/[Personal Loan] prefixes
- BRD 4.2 and Role Management impact row updated (6 -> 4 new permissions); purple-highlighted for re-review
- Repo US AC2.2 and impact table aligned; Application Enquiry maker permission stays per-product

Co-Authored-By: Claude Fable 5 <noreply@anthropic.com>
Claude-Session: https://claude.ai/code/session_01GMyQEZm7CauvpgScBFz4Cf
</commit_message>
<xml_diff>
--- a/docs/brd/Appro_RF_Application_Revert_in_Super_Portal_v1.1.docx
+++ b/docs/brd/Appro_RF_Application_Revert_in_Super_Portal_v1.1.docx
@@ -5492,7 +5492,95 @@
           <w:sz w:val="22"/>
           <w:szCs w:val="22"/>
         </w:rPr>
-        <w:t xml:space="preserve">A new queue entry, 'Revert Queue', shall be added under the Manually Queue section in Role Management (Add Role screen). Two role permissions are available per product ([Credit Card] / [Personal Loan]) — View Application &amp; Evaluate Application:</w:t>
+        <w:t xml:space="preserve">A new queue entry, 'Revert Queue', shall be added under the Manually Queue section in Role Management (Add Role screen). </w:t>
+      </w:r>
+      <w:r>
+        <w:rPr>
+          <w:rFonts w:ascii="Arial" w:cs="Arial" w:eastAsia="Arial" w:hAnsi="Arial"/>
+          <w:b w:val="false"/>
+          <w:bCs w:val="false"/>
+          <w:color w:val="6554C0"/>
+          <w:sz w:val="22"/>
+          <w:szCs w:val="22"/>
+        </w:rPr>
+        <w:t xml:space="preserve">Two role permissions — </w:t>
+      </w:r>
+      <w:r>
+        <w:rPr>
+          <w:rFonts w:ascii="Arial" w:cs="Arial" w:eastAsia="Arial" w:hAnsi="Arial"/>
+          <w:b/>
+          <w:bCs/>
+          <w:color w:val="6554C0"/>
+          <w:sz w:val="22"/>
+          <w:szCs w:val="22"/>
+        </w:rPr>
+        <w:t xml:space="preserve">View Application</w:t>
+      </w:r>
+      <w:r>
+        <w:rPr>
+          <w:rFonts w:ascii="Arial" w:cs="Arial" w:eastAsia="Arial" w:hAnsi="Arial"/>
+          <w:b w:val="false"/>
+          <w:bCs w:val="false"/>
+          <w:color w:val="6554C0"/>
+          <w:sz w:val="22"/>
+          <w:szCs w:val="22"/>
+        </w:rPr>
+        <w:t xml:space="preserve"> and </w:t>
+      </w:r>
+      <w:r>
+        <w:rPr>
+          <w:rFonts w:ascii="Arial" w:cs="Arial" w:eastAsia="Arial" w:hAnsi="Arial"/>
+          <w:b/>
+          <w:bCs/>
+          <w:color w:val="6554C0"/>
+          <w:sz w:val="22"/>
+          <w:szCs w:val="22"/>
+        </w:rPr>
+        <w:t xml:space="preserve">Evaluate Application</w:t>
+      </w:r>
+      <w:r>
+        <w:rPr>
+          <w:rFonts w:ascii="Arial" w:cs="Arial" w:eastAsia="Arial" w:hAnsi="Arial"/>
+          <w:b w:val="false"/>
+          <w:bCs w:val="false"/>
+          <w:color w:val="6554C0"/>
+          <w:sz w:val="22"/>
+          <w:szCs w:val="22"/>
+        </w:rPr>
+        <w:t xml:space="preserve"> — apply to the Revert Queue </w:t>
+      </w:r>
+      <w:r>
+        <w:rPr>
+          <w:rFonts w:ascii="Arial" w:cs="Arial" w:eastAsia="Arial" w:hAnsi="Arial"/>
+          <w:b/>
+          <w:bCs/>
+          <w:color w:val="6554C0"/>
+          <w:sz w:val="22"/>
+          <w:szCs w:val="22"/>
+        </w:rPr>
+        <w:t xml:space="preserve">without a per-product split</w:t>
+      </w:r>
+      <w:r>
+        <w:rPr>
+          <w:rFonts w:ascii="Arial" w:cs="Arial" w:eastAsia="Arial" w:hAnsi="Arial"/>
+          <w:b w:val="false"/>
+          <w:bCs w:val="false"/>
+          <w:color w:val="6554C0"/>
+          <w:sz w:val="22"/>
+          <w:szCs w:val="22"/>
+        </w:rPr>
+        <w:t xml:space="preserve">: each is a single permission covering all applicable products (CC and PL), consistent with the queue listing all products in one view</w:t>
+      </w:r>
+      <w:r>
+        <w:rPr>
+          <w:rFonts w:ascii="Arial" w:cs="Arial" w:eastAsia="Arial" w:hAnsi="Arial"/>
+          <w:b w:val="false"/>
+          <w:bCs w:val="false"/>
+          <w:color w:val="000000"/>
+          <w:sz w:val="22"/>
+          <w:szCs w:val="22"/>
+        </w:rPr>
+        <w:t xml:space="preserve">:</w:t>
       </w:r>
     </w:p>
     <w:tbl>
@@ -5692,7 +5780,29 @@
                 <w:sz w:val="21"/>
                 <w:szCs w:val="21"/>
               </w:rPr>
-              <w:t xml:space="preserve">Users can access Revert Queue list view AND view Application Details for that product.</w:t>
+              <w:t xml:space="preserve">Users can access Revert Queue list view AND view Application Details </w:t>
+            </w:r>
+            <w:r>
+              <w:rPr>
+                <w:rFonts w:ascii="Arial" w:cs="Arial" w:eastAsia="Arial" w:hAnsi="Arial"/>
+                <w:b w:val="false"/>
+                <w:bCs w:val="false"/>
+                <w:color w:val="6554C0"/>
+                <w:sz w:val="21"/>
+                <w:szCs w:val="21"/>
+              </w:rPr>
+              <w:t xml:space="preserve">for all applicable products</w:t>
+            </w:r>
+            <w:r>
+              <w:rPr>
+                <w:rFonts w:ascii="Arial" w:cs="Arial" w:eastAsia="Arial" w:hAnsi="Arial"/>
+                <w:b w:val="false"/>
+                <w:bCs w:val="false"/>
+                <w:color w:val="000000"/>
+                <w:sz w:val="21"/>
+                <w:szCs w:val="21"/>
+              </w:rPr>
+              <w:t xml:space="preserve">.</w:t>
             </w:r>
           </w:p>
         </w:tc>
@@ -5773,7 +5883,7 @@
                 <w:sz w:val="21"/>
                 <w:szCs w:val="21"/>
               </w:rPr>
-              <w:t xml:space="preserve">Users cannot see the Revert Queue in the Queue menu for that product.</w:t>
+              <w:t xml:space="preserve">Users cannot see the Revert Queue in the Queue menu.</w:t>
             </w:r>
           </w:p>
         </w:tc>
@@ -11266,11 +11376,44 @@
                 <w:rFonts w:ascii="Arial" w:cs="Arial" w:eastAsia="Arial" w:hAnsi="Arial"/>
                 <w:b w:val="false"/>
                 <w:bCs w:val="false"/>
-                <w:color w:val="000000"/>
-                <w:sz w:val="21"/>
-                <w:szCs w:val="21"/>
-              </w:rPr>
-              <w:t xml:space="preserve">Six new permission entries, per product: [CC]/[PL] × 'Revert Application' (Enquiry &gt; Application Enquiry) and [CC]/[PL] × View / Evaluate Application (Manually Queue &gt; Revert Queue). Each is a distinct right — bundling permissions that cover different actions has previously required production hotfixes. The Permission Matrix reference page must be updated.</w:t>
+                <w:color w:val="6554C0"/>
+                <w:sz w:val="21"/>
+                <w:szCs w:val="21"/>
+              </w:rPr>
+              <w:t xml:space="preserve">Four new permission entries:</w:t>
+            </w:r>
+            <w:r>
+              <w:rPr>
+                <w:rFonts w:ascii="Arial" w:cs="Arial" w:eastAsia="Arial" w:hAnsi="Arial"/>
+                <w:b w:val="false"/>
+                <w:bCs w:val="false"/>
+                <w:color w:val="000000"/>
+                <w:sz w:val="21"/>
+                <w:szCs w:val="21"/>
+              </w:rPr>
+              <w:t xml:space="preserve"> [CC]/[PL] × 'Revert Application' (per product, Enquiry &gt; Application Enquiry) </w:t>
+            </w:r>
+            <w:r>
+              <w:rPr>
+                <w:rFonts w:ascii="Arial" w:cs="Arial" w:eastAsia="Arial" w:hAnsi="Arial"/>
+                <w:b w:val="false"/>
+                <w:bCs w:val="false"/>
+                <w:color w:val="6554C0"/>
+                <w:sz w:val="21"/>
+                <w:szCs w:val="21"/>
+              </w:rPr>
+              <w:t xml:space="preserve">plus 'View Application' and 'Evaluate Application' on the Revert Queue (Manually Queue) — product-agnostic, one permission each across CC and PL</w:t>
+            </w:r>
+            <w:r>
+              <w:rPr>
+                <w:rFonts w:ascii="Arial" w:cs="Arial" w:eastAsia="Arial" w:hAnsi="Arial"/>
+                <w:b w:val="false"/>
+                <w:bCs w:val="false"/>
+                <w:color w:val="000000"/>
+                <w:sz w:val="21"/>
+                <w:szCs w:val="21"/>
+              </w:rPr>
+              <w:t xml:space="preserve">. Each is a distinct right — bundling permissions that cover different actions has previously required production hotfixes. The Permission Matrix reference page must be updated.</w:t>
             </w:r>
           </w:p>
         </w:tc>

</xml_diff>

<commit_message>
BRD V1.1: absorb Head-of-Retail items that are BRD-functional
- 4.2: self-approval technically prevented (maker-checker control)
- 4.5: Revert Queue TAT via Queue Assignment Management enhancement; timeout subject to Credit/Risk confirmation
- 4.6: re-run list extended (segmentation/strategy, eligibility); versioning and before/after edit audit bullet
- New 4.8: atomic transitions, duplicate/concurrent prevention, retry/rollback in tech design
- 6: disclosures regenerated on standard offer/acceptance journey (KFS)

Co-Authored-By: Claude Fable 5 <noreply@anthropic.com>
Claude-Session: https://claude.ai/code/session_01GMyQEZm7CauvpgScBFz4Cf
</commit_message>
<xml_diff>
--- a/docs/brd/Appro_RF_Application_Revert_in_Super_Portal_v1.1.docx
+++ b/docs/brd/Appro_RF_Application_Revert_in_Super_Portal_v1.1.docx
@@ -6064,6 +6064,33 @@
     </w:tbl>
     <w:p>
       <w:pPr>
+        <w:spacing w:after="120" w:before="40" w:line="264"/>
+      </w:pPr>
+      <w:r>
+        <w:rPr>
+          <w:rFonts w:ascii="Arial" w:cs="Arial" w:eastAsia="Arial" w:hAnsi="Arial"/>
+          <w:b/>
+          <w:bCs/>
+          <w:color w:val="6554C0"/>
+          <w:sz w:val="22"/>
+          <w:szCs w:val="22"/>
+        </w:rPr>
+        <w:t xml:space="preserve">Maker–checker control — self-approval technically prevented:</w:t>
+      </w:r>
+      <w:r>
+        <w:rPr>
+          <w:rFonts w:ascii="Arial" w:cs="Arial" w:eastAsia="Arial" w:hAnsi="Arial"/>
+          <w:b w:val="false"/>
+          <w:bCs w:val="false"/>
+          <w:color w:val="6554C0"/>
+          <w:sz w:val="22"/>
+          <w:szCs w:val="22"/>
+        </w:rPr>
+        <w:t xml:space="preserve"> the Checker must be a different user from the requester. A user who submitted a revert request cannot approve or reject that same request, even if they hold the Evaluate Application permission — the system blocks the action for the requesting user id.</w:t>
+      </w:r>
+    </w:p>
+    <w:p>
+      <w:pPr>
         <w:pStyle w:val="Heading2"/>
         <w:spacing w:after="120" w:before="240"/>
       </w:pPr>
@@ -7449,6 +7476,66 @@
     </w:tbl>
     <w:p>
       <w:pPr>
+        <w:spacing w:after="120" w:before="40" w:line="264"/>
+      </w:pPr>
+      <w:r>
+        <w:rPr>
+          <w:rFonts w:ascii="Arial" w:cs="Arial" w:eastAsia="Arial" w:hAnsi="Arial"/>
+          <w:b w:val="false"/>
+          <w:bCs w:val="false"/>
+          <w:color w:val="6554C0"/>
+          <w:sz w:val="22"/>
+          <w:szCs w:val="22"/>
+        </w:rPr>
+        <w:t xml:space="preserve">Queue ageing, reminders and escalation for the Revert Queue follow the platform-wide </w:t>
+      </w:r>
+      <w:r>
+        <w:rPr>
+          <w:rFonts w:ascii="Arial" w:cs="Arial" w:eastAsia="Arial" w:hAnsi="Arial"/>
+          <w:b/>
+          <w:bCs/>
+          <w:color w:val="6554C0"/>
+          <w:sz w:val="22"/>
+          <w:szCs w:val="22"/>
+        </w:rPr>
+        <w:t xml:space="preserve">Queue Assignment Management (TAT)</w:t>
+      </w:r>
+      <w:r>
+        <w:rPr>
+          <w:rFonts w:ascii="Arial" w:cs="Arial" w:eastAsia="Arial" w:hAnsi="Arial"/>
+          <w:b w:val="false"/>
+          <w:bCs w:val="false"/>
+          <w:color w:val="6554C0"/>
+          <w:sz w:val="22"/>
+          <w:szCs w:val="22"/>
+        </w:rPr>
+        <w:t xml:space="preserve"> enhancement currently in delivery — the Revert Queue receives its TAT configuration once that capability lands (configuration, not new build). The [X]-day auto-approval behaviour above remains </w:t>
+      </w:r>
+      <w:r>
+        <w:rPr>
+          <w:rFonts w:ascii="Arial" w:cs="Arial" w:eastAsia="Arial" w:hAnsi="Arial"/>
+          <w:b/>
+          <w:bCs/>
+          <w:color w:val="6554C0"/>
+          <w:sz w:val="22"/>
+          <w:szCs w:val="22"/>
+        </w:rPr>
+        <w:t xml:space="preserve">subject to Credit/Risk confirmation</w:t>
+      </w:r>
+      <w:r>
+        <w:rPr>
+          <w:rFonts w:ascii="Arial" w:cs="Arial" w:eastAsia="Arial" w:hAnsi="Arial"/>
+          <w:b w:val="false"/>
+          <w:bCs w:val="false"/>
+          <w:color w:val="6554C0"/>
+          <w:sz w:val="22"/>
+          <w:szCs w:val="22"/>
+        </w:rPr>
+        <w:t xml:space="preserve">; should Credit/Risk prefer no auto-action or an auto-expiry of the request on timeout, this section will be revised accordingly.</w:t>
+      </w:r>
+    </w:p>
+    <w:p>
+      <w:pPr>
         <w:pStyle w:val="Heading2"/>
         <w:spacing w:after="120" w:before="240"/>
       </w:pPr>
@@ -7617,24 +7704,29 @@
           <w:sz w:val="22"/>
           <w:szCs w:val="22"/>
         </w:rPr>
-        <w:t xml:space="preserve"> trigger a new FTS request. The re-assessment re-runs the Rule Engine, DBR calculation and Limit Assignment on the data already held against the application. Where the validity of a data item has expired, the refresh approach is agreed with Credit/Risk — no external call is fired automatically by the revert.</w:t>
-      </w:r>
-    </w:p>
-    <w:p>
-      <w:pPr>
-        <w:pStyle w:val="Heading2"/>
-        <w:spacing w:after="120" w:before="240"/>
-      </w:pPr>
+        <w:t xml:space="preserve"> trigger a new FTS request. The re-assessment re-runs the </w:t>
+      </w:r>
       <w:r>
         <w:rPr>
           <w:rFonts w:ascii="Arial" w:cs="Arial" w:eastAsia="Arial" w:hAnsi="Arial"/>
           <w:b/>
           <w:bCs/>
-          <w:color w:val="000000"/>
-          <w:sz w:val="22"/>
-          <w:szCs w:val="22"/>
-        </w:rPr>
-        <w:t xml:space="preserve">4.7 Multiple reverts</w:t>
+          <w:color w:val="6554C0"/>
+          <w:sz w:val="22"/>
+          <w:szCs w:val="22"/>
+        </w:rPr>
+        <w:t xml:space="preserve">Rule Engine (segmentation / strategy evaluation), DBR calculation, Limit Assignment and eligibility checks</w:t>
+      </w:r>
+      <w:r>
+        <w:rPr>
+          <w:rFonts w:ascii="Arial" w:cs="Arial" w:eastAsia="Arial" w:hAnsi="Arial"/>
+          <w:b w:val="false"/>
+          <w:bCs w:val="false"/>
+          <w:color w:val="6554C0"/>
+          <w:sz w:val="22"/>
+          <w:szCs w:val="22"/>
+        </w:rPr>
+        <w:t xml:space="preserve"> on the data already held against the application. Where the validity of a data item has expired, the refresh approach is agreed with Credit/Risk — no external call is fired automatically by the revert.</w:t>
       </w:r>
     </w:p>
     <w:p>
@@ -7649,24 +7741,13 @@
       <w:r>
         <w:rPr>
           <w:rFonts w:ascii="Arial" w:cs="Arial" w:eastAsia="Arial" w:hAnsi="Arial"/>
-          <w:b w:val="false"/>
-          <w:bCs w:val="false"/>
-          <w:color w:val="6554C0"/>
-          <w:sz w:val="22"/>
-          <w:szCs w:val="22"/>
-        </w:rPr>
-        <w:t xml:space="preserve">The same application </w:t>
-      </w:r>
-      <w:r>
-        <w:rPr>
-          <w:rFonts w:ascii="Arial" w:cs="Arial" w:eastAsia="Arial" w:hAnsi="Arial"/>
           <w:b/>
           <w:bCs/>
           <w:color w:val="6554C0"/>
           <w:sz w:val="22"/>
           <w:szCs w:val="22"/>
         </w:rPr>
-        <w:t xml:space="preserve">can be reverted more than once</w:t>
+        <w:t xml:space="preserve">Versioning and edit audit:</w:t>
       </w:r>
       <w:r>
         <w:rPr>
@@ -7677,7 +7758,24 @@
           <w:sz w:val="22"/>
           <w:szCs w:val="22"/>
         </w:rPr>
-        <w:t xml:space="preserve"> — no cap applies to the number of reverts per application in this version.</w:t>
+        <w:t xml:space="preserve"> the re-assessment evaluates against the currently published strategy, score-check and income-multiplier versions, and the applied versions are recorded in the audit trail. Parameter edits made in Credit Queue remain audit-trailed under the existing Credit Queue behaviour (before/after values).</w:t>
+      </w:r>
+    </w:p>
+    <w:p>
+      <w:pPr>
+        <w:pStyle w:val="Heading2"/>
+        <w:spacing w:after="120" w:before="240"/>
+      </w:pPr>
+      <w:r>
+        <w:rPr>
+          <w:rFonts w:ascii="Arial" w:cs="Arial" w:eastAsia="Arial" w:hAnsi="Arial"/>
+          <w:b/>
+          <w:bCs/>
+          <w:color w:val="000000"/>
+          <w:sz w:val="22"/>
+          <w:szCs w:val="22"/>
+        </w:rPr>
+        <w:t xml:space="preserve">4.7 Multiple reverts</w:t>
       </w:r>
     </w:p>
     <w:p>
@@ -7692,12 +7790,55 @@
       <w:r>
         <w:rPr>
           <w:rFonts w:ascii="Arial" w:cs="Arial" w:eastAsia="Arial" w:hAnsi="Arial"/>
+          <w:b w:val="false"/>
+          <w:bCs w:val="false"/>
+          <w:color w:val="6554C0"/>
+          <w:sz w:val="22"/>
+          <w:szCs w:val="22"/>
+        </w:rPr>
+        <w:t xml:space="preserve">The same application </w:t>
+      </w:r>
+      <w:r>
+        <w:rPr>
+          <w:rFonts w:ascii="Arial" w:cs="Arial" w:eastAsia="Arial" w:hAnsi="Arial"/>
           <w:b/>
           <w:bCs/>
           <w:color w:val="6554C0"/>
           <w:sz w:val="22"/>
           <w:szCs w:val="22"/>
         </w:rPr>
+        <w:t xml:space="preserve">can be reverted more than once</w:t>
+      </w:r>
+      <w:r>
+        <w:rPr>
+          <w:rFonts w:ascii="Arial" w:cs="Arial" w:eastAsia="Arial" w:hAnsi="Arial"/>
+          <w:b w:val="false"/>
+          <w:bCs w:val="false"/>
+          <w:color w:val="6554C0"/>
+          <w:sz w:val="22"/>
+          <w:szCs w:val="22"/>
+        </w:rPr>
+        <w:t xml:space="preserve"> — no cap applies to the number of reverts per application in this version.</w:t>
+      </w:r>
+    </w:p>
+    <w:p>
+      <w:pPr>
+        <w:pStyle w:val="ListParagraph"/>
+        <w:numPr>
+          <w:ilvl w:val="0"/>
+          <w:numId w:val="1"/>
+        </w:numPr>
+        <w:spacing w:after="80" w:before="30" w:line="264"/>
+      </w:pPr>
+      <w:r>
+        <w:rPr>
+          <w:rFonts w:ascii="Arial" w:cs="Arial" w:eastAsia="Arial" w:hAnsi="Arial"/>
+          <w:b/>
+          <w:bCs/>
+          <w:color w:val="6554C0"/>
+          <w:sz w:val="22"/>
+          <w:szCs w:val="22"/>
+        </w:rPr>
         <w:t xml:space="preserve">Each revert is maintained in the audit trail:</w:t>
       </w:r>
       <w:r>
@@ -7710,6 +7851,87 @@
           <w:szCs w:val="22"/>
         </w:rPr>
         <w:t xml:space="preserve"> every revert cycle writes its own complete audit set — initiation ('Manually initiate revert'), the Checker decision ('Revert Queue') or the timeout ('Auto Revert Approval on timeout'), and the outcome. The original rejection record is never modified, so the full history of every revert remains visible in the application history in chronological order.</w:t>
+      </w:r>
+    </w:p>
+    <w:p>
+      <w:pPr>
+        <w:pStyle w:val="Heading2"/>
+        <w:spacing w:after="120" w:before="240"/>
+      </w:pPr>
+      <w:r>
+        <w:rPr>
+          <w:rFonts w:ascii="Arial" w:cs="Arial" w:eastAsia="Arial" w:hAnsi="Arial"/>
+          <w:b/>
+          <w:bCs/>
+          <w:color w:val="000000"/>
+          <w:sz w:val="22"/>
+          <w:szCs w:val="22"/>
+        </w:rPr>
+        <w:t xml:space="preserve">4.8 Exception handling and duplicate prevention</w:t>
+      </w:r>
+    </w:p>
+    <w:p>
+      <w:pPr>
+        <w:pStyle w:val="ListParagraph"/>
+        <w:numPr>
+          <w:ilvl w:val="0"/>
+          <w:numId w:val="1"/>
+        </w:numPr>
+        <w:spacing w:after="80" w:before="30" w:line="264"/>
+      </w:pPr>
+      <w:r>
+        <w:rPr>
+          <w:rFonts w:ascii="Arial" w:cs="Arial" w:eastAsia="Arial" w:hAnsi="Arial"/>
+          <w:b/>
+          <w:bCs/>
+          <w:color w:val="6554C0"/>
+          <w:sz w:val="22"/>
+          <w:szCs w:val="22"/>
+        </w:rPr>
+        <w:t xml:space="preserve">Atomic transitions:</w:t>
+      </w:r>
+      <w:r>
+        <w:rPr>
+          <w:rFonts w:ascii="Arial" w:cs="Arial" w:eastAsia="Arial" w:hAnsi="Arial"/>
+          <w:b w:val="false"/>
+          <w:bCs w:val="false"/>
+          <w:color w:val="6554C0"/>
+          <w:sz w:val="22"/>
+          <w:szCs w:val="22"/>
+        </w:rPr>
+        <w:t xml:space="preserve"> if any step of a revert action fails — queue movement, status update, Rule Engine / Limit Assignment run or notification — the application remains in its previous consistent state and the action can be safely retried. No application may remain stuck or partially processed between states.</w:t>
+      </w:r>
+    </w:p>
+    <w:p>
+      <w:pPr>
+        <w:pStyle w:val="ListParagraph"/>
+        <w:numPr>
+          <w:ilvl w:val="0"/>
+          <w:numId w:val="1"/>
+        </w:numPr>
+        <w:spacing w:after="80" w:before="30" w:line="264"/>
+      </w:pPr>
+      <w:r>
+        <w:rPr>
+          <w:rFonts w:ascii="Arial" w:cs="Arial" w:eastAsia="Arial" w:hAnsi="Arial"/>
+          <w:b/>
+          <w:bCs/>
+          <w:color w:val="6554C0"/>
+          <w:sz w:val="22"/>
+          <w:szCs w:val="22"/>
+        </w:rPr>
+        <w:t xml:space="preserve">Duplicate and concurrent actions prevented:</w:t>
+      </w:r>
+      <w:r>
+        <w:rPr>
+          <w:rFonts w:ascii="Arial" w:cs="Arial" w:eastAsia="Arial" w:hAnsi="Arial"/>
+          <w:b w:val="false"/>
+          <w:bCs w:val="false"/>
+          <w:color w:val="6554C0"/>
+          <w:sz w:val="22"/>
+          <w:szCs w:val="22"/>
+        </w:rPr>
+        <w:t xml:space="preserve"> a single pending revert request per application is enforced (Revert_App flag — the Revert button is disabled while a request is pending), and a request that has already been decided cannot be decided again. The detailed retry / rollback design is elaborated in the technical design document for this feature.</w:t>
       </w:r>
     </w:p>
     <w:p>
@@ -9521,6 +9743,60 @@
           <w:szCs w:val="22"/>
         </w:rPr>
         <w:t xml:space="preserve"> — the countdown begins again at the new rejection date.</w:t>
+      </w:r>
+    </w:p>
+    <w:p>
+      <w:pPr>
+        <w:pStyle w:val="ListParagraph"/>
+        <w:numPr>
+          <w:ilvl w:val="0"/>
+          <w:numId w:val="1"/>
+        </w:numPr>
+        <w:spacing w:after="80" w:before="30" w:line="264"/>
+      </w:pPr>
+      <w:r>
+        <w:rPr>
+          <w:rFonts w:ascii="Arial" w:cs="Arial" w:eastAsia="Arial" w:hAnsi="Arial"/>
+          <w:b/>
+          <w:bCs/>
+          <w:color w:val="6554C0"/>
+          <w:sz w:val="22"/>
+          <w:szCs w:val="22"/>
+        </w:rPr>
+        <w:t xml:space="preserve">Disclosures on the reopened journey:</w:t>
+      </w:r>
+      <w:r>
+        <w:rPr>
+          <w:rFonts w:ascii="Arial" w:cs="Arial" w:eastAsia="Arial" w:hAnsi="Arial"/>
+          <w:b w:val="false"/>
+          <w:bCs w:val="false"/>
+          <w:color w:val="6554C0"/>
+          <w:sz w:val="22"/>
+          <w:szCs w:val="22"/>
+        </w:rPr>
+        <w:t xml:space="preserve"> after an approved re-assessment, the application proceeds through the </w:t>
+      </w:r>
+      <w:r>
+        <w:rPr>
+          <w:rFonts w:ascii="Arial" w:cs="Arial" w:eastAsia="Arial" w:hAnsi="Arial"/>
+          <w:b/>
+          <w:bCs/>
+          <w:color w:val="6554C0"/>
+          <w:sz w:val="22"/>
+          <w:szCs w:val="22"/>
+        </w:rPr>
+        <w:t xml:space="preserve">standard offer and acceptance journey</w:t>
+      </w:r>
+      <w:r>
+        <w:rPr>
+          <w:rFonts w:ascii="Arial" w:cs="Arial" w:eastAsia="Arial" w:hAnsi="Arial"/>
+          <w:b w:val="false"/>
+          <w:bCs w:val="false"/>
+          <w:color w:val="6554C0"/>
+          <w:sz w:val="22"/>
+          <w:szCs w:val="22"/>
+        </w:rPr>
+        <w:t xml:space="preserve"> — AIP, cooling-off and KFS/DDA signature stages are generated afresh by the existing flow, so every disclosure the customer receives reflects the final approved terms (no change to existing KFS behaviour).</w:t>
       </w:r>
     </w:p>
     <w:p>

</xml_diff>

<commit_message>
Revert Application maker permission made product-agnostic (matches existing system)
- PO shared the live Application Enquiry permission section: View/Cancel Application carry no product prefix, so the new Revert Application follows the same layout
- SC1 composite and ia_role.png impact crop regenerated (single Revert Application entry)
- BRD section 1 (intro bullet, component table, permission behaviour) and overview key step updated; impact row now 3 new permissions, all product-agnostic; purple-highlighted
- Repo US aligned (AC1 component table, AC2.2 role bullet, impact row)

Co-Authored-By: Claude Fable 5 <noreply@anthropic.com>
Claude-Session: https://claude.ai/code/session_01GMyQEZm7CauvpgScBFz4Cf
</commit_message>
<xml_diff>
--- a/docs/brd/Appro_RF_Application_Revert_in_Super_Portal_v1.1.docx
+++ b/docs/brd/Appro_RF_Application_Revert_in_Super_Portal_v1.1.docx
@@ -410,7 +410,29 @@
           <w:sz w:val="22"/>
           <w:szCs w:val="22"/>
         </w:rPr>
-        <w:t xml:space="preserve">Bank user with '[Product] Revert Application' permission initiates the revert request from Application Enquiry, with a mandatory Revert Reason.</w:t>
+        <w:t xml:space="preserve">Bank user with '</w:t>
+      </w:r>
+      <w:r>
+        <w:rPr>
+          <w:rFonts w:ascii="Arial" w:cs="Arial" w:eastAsia="Arial" w:hAnsi="Arial"/>
+          <w:b w:val="false"/>
+          <w:bCs w:val="false"/>
+          <w:color w:val="6554C0"/>
+          <w:sz w:val="22"/>
+          <w:szCs w:val="22"/>
+        </w:rPr>
+        <w:t xml:space="preserve">Revert Application</w:t>
+      </w:r>
+      <w:r>
+        <w:rPr>
+          <w:rFonts w:ascii="Arial" w:cs="Arial" w:eastAsia="Arial" w:hAnsi="Arial"/>
+          <w:b w:val="false"/>
+          <w:bCs w:val="false"/>
+          <w:color w:val="000000"/>
+          <w:sz w:val="22"/>
+          <w:szCs w:val="22"/>
+        </w:rPr>
+        <w:t xml:space="preserve">' permission initiates the revert request from Application Enquiry, with a mandatory Revert Reason.</w:t>
       </w:r>
     </w:p>
     <w:p>
@@ -2469,24 +2491,46 @@
       <w:r>
         <w:rPr>
           <w:rFonts w:ascii="Arial" w:cs="Arial" w:eastAsia="Arial" w:hAnsi="Arial"/>
+          <w:b w:val="false"/>
+          <w:bCs w:val="false"/>
+          <w:color w:val="6554C0"/>
+          <w:sz w:val="22"/>
+          <w:szCs w:val="22"/>
+        </w:rPr>
+        <w:t xml:space="preserve">a </w:t>
+      </w:r>
+      <w:r>
+        <w:rPr>
+          <w:rFonts w:ascii="Arial" w:cs="Arial" w:eastAsia="Arial" w:hAnsi="Arial"/>
           <w:b/>
           <w:bCs/>
-          <w:color w:val="000000"/>
-          <w:sz w:val="22"/>
-          <w:szCs w:val="22"/>
-        </w:rPr>
-        <w:t xml:space="preserve">per product tab</w:t>
-      </w:r>
-      <w:r>
-        <w:rPr>
-          <w:rFonts w:ascii="Arial" w:cs="Arial" w:eastAsia="Arial" w:hAnsi="Arial"/>
-          <w:b w:val="false"/>
-          <w:bCs w:val="false"/>
-          <w:color w:val="000000"/>
-          <w:sz w:val="22"/>
-          <w:szCs w:val="22"/>
-        </w:rPr>
-        <w:t xml:space="preserve">, alongside the existing 'View Application' and 'Cancel Application' permissions: '[Credit Card] Revert Application' and '[Personal Loan] Revert Application'.</w:t>
+          <w:color w:val="6554C0"/>
+          <w:sz w:val="22"/>
+          <w:szCs w:val="22"/>
+        </w:rPr>
+        <w:t xml:space="preserve">single permission with no per-product split</w:t>
+      </w:r>
+      <w:r>
+        <w:rPr>
+          <w:rFonts w:ascii="Arial" w:cs="Arial" w:eastAsia="Arial" w:hAnsi="Arial"/>
+          <w:b w:val="false"/>
+          <w:bCs w:val="false"/>
+          <w:color w:val="6554C0"/>
+          <w:sz w:val="22"/>
+          <w:szCs w:val="22"/>
+        </w:rPr>
+        <w:t xml:space="preserve">, alongside the existing 'View Application' and 'Cancel Application' permissions and matching their existing product-agnostic layout</w:t>
+      </w:r>
+      <w:r>
+        <w:rPr>
+          <w:rFonts w:ascii="Arial" w:cs="Arial" w:eastAsia="Arial" w:hAnsi="Arial"/>
+          <w:b w:val="false"/>
+          <w:bCs w:val="false"/>
+          <w:color w:val="000000"/>
+          <w:sz w:val="22"/>
+          <w:szCs w:val="22"/>
+        </w:rPr>
+        <w:t xml:space="preserve">.</w:t>
       </w:r>
     </w:p>
     <w:p>
@@ -2745,11 +2789,11 @@
                 <w:rFonts w:ascii="Arial" w:cs="Arial" w:eastAsia="Arial" w:hAnsi="Arial"/>
                 <w:b w:val="false"/>
                 <w:bCs w:val="false"/>
-                <w:color w:val="000000"/>
-                <w:sz w:val="21"/>
-                <w:szCs w:val="21"/>
-              </w:rPr>
-              <w:t xml:space="preserve">[Credit Card] Revert Application Checkbox</w:t>
+                <w:color w:val="6554C0"/>
+                <w:sz w:val="21"/>
+                <w:szCs w:val="21"/>
+              </w:rPr>
+              <w:t xml:space="preserve">Revert Application Checkbox</w:t>
             </w:r>
           </w:p>
         </w:tc>
@@ -2861,11 +2905,11 @@
                 <w:rFonts w:ascii="Arial" w:cs="Arial" w:eastAsia="Arial" w:hAnsi="Arial"/>
                 <w:b w:val="false"/>
                 <w:bCs w:val="false"/>
-                <w:color w:val="000000"/>
-                <w:sz w:val="21"/>
-                <w:szCs w:val="21"/>
-              </w:rPr>
-              <w:t xml:space="preserve">Selectable checkbox to grant or revoke the 'Revert Application' permission for Credit Card applications. It indicates whether the role holder can request application reverts.</w:t>
+                <w:color w:val="6554C0"/>
+                <w:sz w:val="21"/>
+                <w:szCs w:val="21"/>
+              </w:rPr>
+              <w:t xml:space="preserve">Selectable checkbox to grant or revoke the 'Revert Application' permission. It indicates whether the role holder can request application reverts for the applicable products (CC and PL).</w:t>
             </w:r>
           </w:p>
         </w:tc>
@@ -2899,7 +2943,7 @@
                 <w:sz w:val="21"/>
                 <w:szCs w:val="21"/>
               </w:rPr>
-              <w:t xml:space="preserve">[Personal Loan] Revert Application Checkbox</w:t>
+              <w:t xml:space="preserve">Revert Application Label</w:t>
             </w:r>
           </w:p>
         </w:tc>
@@ -2928,7 +2972,7 @@
                 <w:sz w:val="21"/>
                 <w:szCs w:val="21"/>
               </w:rPr>
-              <w:t xml:space="preserve">Checkbox</w:t>
+              <w:t xml:space="preserve">Label</w:t>
             </w:r>
           </w:p>
         </w:tc>
@@ -2957,7 +3001,7 @@
                 <w:sz w:val="21"/>
                 <w:szCs w:val="21"/>
               </w:rPr>
-              <w:t xml:space="preserve">Yes</w:t>
+              <w:t xml:space="preserve">N/A</w:t>
             </w:r>
           </w:p>
         </w:tc>
@@ -3011,161 +3055,11 @@
                 <w:rFonts w:ascii="Arial" w:cs="Arial" w:eastAsia="Arial" w:hAnsi="Arial"/>
                 <w:b w:val="false"/>
                 <w:bCs w:val="false"/>
-                <w:color w:val="000000"/>
-                <w:sz w:val="21"/>
-                <w:szCs w:val="21"/>
-              </w:rPr>
-              <w:t xml:space="preserve">Selectable checkbox to grant or revoke the 'Revert Application' permission for Personal Loan applications.</w:t>
-            </w:r>
-          </w:p>
-        </w:tc>
-      </w:tr>
-      <w:tr>
-        <w:trPr>
-          <w:cantSplit/>
-        </w:trPr>
-        <w:tc>
-          <w:tcPr>
-            <w:tcW w:type="dxa" w:w="1895"/>
-            <w:shd w:fill="FFFFFF" w:color="auto" w:val="clear"/>
-            <w:tcMar>
-              <w:top w:type="dxa" w:w="90"/>
-              <w:left w:type="dxa" w:w="110"/>
-              <w:bottom w:type="dxa" w:w="90"/>
-              <w:right w:type="dxa" w:w="110"/>
-            </w:tcMar>
-            <w:vAlign w:val="top"/>
-          </w:tcPr>
-          <w:p>
-            <w:pPr>
-              <w:spacing w:after="0" w:before="0" w:line="252"/>
-            </w:pPr>
-            <w:r>
-              <w:rPr>
-                <w:rFonts w:ascii="Arial" w:cs="Arial" w:eastAsia="Arial" w:hAnsi="Arial"/>
-                <w:b w:val="false"/>
-                <w:bCs w:val="false"/>
-                <w:color w:val="000000"/>
-                <w:sz w:val="21"/>
-                <w:szCs w:val="21"/>
-              </w:rPr>
-              <w:t xml:space="preserve">Revert Application Label</w:t>
-            </w:r>
-          </w:p>
-        </w:tc>
-        <w:tc>
-          <w:tcPr>
-            <w:tcW w:type="dxa" w:w="1264"/>
-            <w:shd w:fill="FFFFFF" w:color="auto" w:val="clear"/>
-            <w:tcMar>
-              <w:top w:type="dxa" w:w="90"/>
-              <w:left w:type="dxa" w:w="110"/>
-              <w:bottom w:type="dxa" w:w="90"/>
-              <w:right w:type="dxa" w:w="110"/>
-            </w:tcMar>
-            <w:vAlign w:val="top"/>
-          </w:tcPr>
-          <w:p>
-            <w:pPr>
-              <w:spacing w:after="0" w:before="0" w:line="252"/>
-            </w:pPr>
-            <w:r>
-              <w:rPr>
-                <w:rFonts w:ascii="Arial" w:cs="Arial" w:eastAsia="Arial" w:hAnsi="Arial"/>
-                <w:b w:val="false"/>
-                <w:bCs w:val="false"/>
-                <w:color w:val="000000"/>
-                <w:sz w:val="21"/>
-                <w:szCs w:val="21"/>
-              </w:rPr>
-              <w:t xml:space="preserve">Label</w:t>
-            </w:r>
-          </w:p>
-        </w:tc>
-        <w:tc>
-          <w:tcPr>
-            <w:tcW w:type="dxa" w:w="1173"/>
-            <w:shd w:fill="FFFFFF" w:color="auto" w:val="clear"/>
-            <w:tcMar>
-              <w:top w:type="dxa" w:w="90"/>
-              <w:left w:type="dxa" w:w="110"/>
-              <w:bottom w:type="dxa" w:w="90"/>
-              <w:right w:type="dxa" w:w="110"/>
-            </w:tcMar>
-            <w:vAlign w:val="top"/>
-          </w:tcPr>
-          <w:p>
-            <w:pPr>
-              <w:spacing w:after="0" w:before="0" w:line="252"/>
-            </w:pPr>
-            <w:r>
-              <w:rPr>
-                <w:rFonts w:ascii="Arial" w:cs="Arial" w:eastAsia="Arial" w:hAnsi="Arial"/>
-                <w:b w:val="false"/>
-                <w:bCs w:val="false"/>
-                <w:color w:val="000000"/>
-                <w:sz w:val="21"/>
-                <w:szCs w:val="21"/>
-              </w:rPr>
-              <w:t xml:space="preserve">N/A</w:t>
-            </w:r>
-          </w:p>
-        </w:tc>
-        <w:tc>
-          <w:tcPr>
-            <w:tcW w:type="dxa" w:w="1444"/>
-            <w:shd w:fill="FFFFFF" w:color="auto" w:val="clear"/>
-            <w:tcMar>
-              <w:top w:type="dxa" w:w="90"/>
-              <w:left w:type="dxa" w:w="110"/>
-              <w:bottom w:type="dxa" w:w="90"/>
-              <w:right w:type="dxa" w:w="110"/>
-            </w:tcMar>
-            <w:vAlign w:val="top"/>
-          </w:tcPr>
-          <w:p>
-            <w:pPr>
-              <w:spacing w:after="0" w:before="0" w:line="252"/>
-            </w:pPr>
-            <w:r>
-              <w:rPr>
-                <w:rFonts w:ascii="Arial" w:cs="Arial" w:eastAsia="Arial" w:hAnsi="Arial"/>
-                <w:b w:val="false"/>
-                <w:bCs w:val="false"/>
-                <w:color w:val="000000"/>
-                <w:sz w:val="21"/>
-                <w:szCs w:val="21"/>
-              </w:rPr>
-              <w:t xml:space="preserve">N/A</w:t>
-            </w:r>
-          </w:p>
-        </w:tc>
-        <w:tc>
-          <w:tcPr>
-            <w:tcW w:type="dxa" w:w="3250"/>
-            <w:shd w:fill="FFFFFF" w:color="auto" w:val="clear"/>
-            <w:tcMar>
-              <w:top w:type="dxa" w:w="90"/>
-              <w:left w:type="dxa" w:w="110"/>
-              <w:bottom w:type="dxa" w:w="90"/>
-              <w:right w:type="dxa" w:w="110"/>
-            </w:tcMar>
-            <w:vAlign w:val="top"/>
-          </w:tcPr>
-          <w:p>
-            <w:pPr>
-              <w:spacing w:after="0" w:before="0" w:line="252"/>
-            </w:pPr>
-            <w:r>
-              <w:rPr>
-                <w:rFonts w:ascii="Arial" w:cs="Arial" w:eastAsia="Arial" w:hAnsi="Arial"/>
-                <w:b w:val="false"/>
-                <w:bCs w:val="false"/>
-                <w:color w:val="000000"/>
-                <w:sz w:val="21"/>
-                <w:szCs w:val="21"/>
-              </w:rPr>
-              <w:t xml:space="preserve">Descriptive label shown alongside each checkbox, identifying the permission name.</w:t>
+                <w:color w:val="6554C0"/>
+                <w:sz w:val="21"/>
+                <w:szCs w:val="21"/>
+              </w:rPr>
+              <w:t xml:space="preserve">Descriptive label shown alongside the checkbox, identifying the permission name.</w:t>
             </w:r>
           </w:p>
         </w:tc>
@@ -3302,11 +3196,11 @@
                 <w:rFonts w:ascii="Arial" w:cs="Arial" w:eastAsia="Arial" w:hAnsi="Arial"/>
                 <w:b w:val="false"/>
                 <w:bCs w:val="false"/>
-                <w:color w:val="000000"/>
-                <w:sz w:val="21"/>
-                <w:szCs w:val="21"/>
-              </w:rPr>
-              <w:t xml:space="preserve">[Product] Revert Application = TRUE</w:t>
+                <w:color w:val="6554C0"/>
+                <w:sz w:val="21"/>
+                <w:szCs w:val="21"/>
+              </w:rPr>
+              <w:t xml:space="preserve">Revert Application = TRUE</w:t>
             </w:r>
           </w:p>
         </w:tc>
@@ -3335,7 +3229,29 @@
                 <w:sz w:val="21"/>
                 <w:szCs w:val="21"/>
               </w:rPr>
-              <w:t xml:space="preserve">Users can view the 'Revert' button on the Application Enquiry details screen for that product and submit revert requests for Checker approval.</w:t>
+              <w:t xml:space="preserve">Users can view the 'Revert' button on the Application Enquiry details screen </w:t>
+            </w:r>
+            <w:r>
+              <w:rPr>
+                <w:rFonts w:ascii="Arial" w:cs="Arial" w:eastAsia="Arial" w:hAnsi="Arial"/>
+                <w:b w:val="false"/>
+                <w:bCs w:val="false"/>
+                <w:color w:val="6554C0"/>
+                <w:sz w:val="21"/>
+                <w:szCs w:val="21"/>
+              </w:rPr>
+              <w:t xml:space="preserve">for the applicable products</w:t>
+            </w:r>
+            <w:r>
+              <w:rPr>
+                <w:rFonts w:ascii="Arial" w:cs="Arial" w:eastAsia="Arial" w:hAnsi="Arial"/>
+                <w:b w:val="false"/>
+                <w:bCs w:val="false"/>
+                <w:color w:val="000000"/>
+                <w:sz w:val="21"/>
+                <w:szCs w:val="21"/>
+              </w:rPr>
+              <w:t xml:space="preserve"> and submit revert requests for Checker approval.</w:t>
             </w:r>
           </w:p>
         </w:tc>
@@ -3365,11 +3281,11 @@
                 <w:rFonts w:ascii="Arial" w:cs="Arial" w:eastAsia="Arial" w:hAnsi="Arial"/>
                 <w:b w:val="false"/>
                 <w:bCs w:val="false"/>
-                <w:color w:val="000000"/>
-                <w:sz w:val="21"/>
-                <w:szCs w:val="21"/>
-              </w:rPr>
-              <w:t xml:space="preserve">[Product] Revert Application = FALSE</w:t>
+                <w:color w:val="6554C0"/>
+                <w:sz w:val="21"/>
+                <w:szCs w:val="21"/>
+              </w:rPr>
+              <w:t xml:space="preserve">Revert Application = FALSE</w:t>
             </w:r>
           </w:p>
         </w:tc>
@@ -4193,7 +4109,29 @@
                 <w:sz w:val="21"/>
                 <w:szCs w:val="21"/>
               </w:rPr>
-              <w:t xml:space="preserve">Visible only to users with the '[Product] Revert Application' role. Enabled only for a revertible rejected application with no request already pending. It initiates the revert request for the selected application.</w:t>
+              <w:t xml:space="preserve">Visible only to users with the '</w:t>
+            </w:r>
+            <w:r>
+              <w:rPr>
+                <w:rFonts w:ascii="Arial" w:cs="Arial" w:eastAsia="Arial" w:hAnsi="Arial"/>
+                <w:b w:val="false"/>
+                <w:bCs w:val="false"/>
+                <w:color w:val="6554C0"/>
+                <w:sz w:val="21"/>
+                <w:szCs w:val="21"/>
+              </w:rPr>
+              <w:t xml:space="preserve">Revert Application</w:t>
+            </w:r>
+            <w:r>
+              <w:rPr>
+                <w:rFonts w:ascii="Arial" w:cs="Arial" w:eastAsia="Arial" w:hAnsi="Arial"/>
+                <w:b w:val="false"/>
+                <w:bCs w:val="false"/>
+                <w:color w:val="000000"/>
+                <w:sz w:val="21"/>
+                <w:szCs w:val="21"/>
+              </w:rPr>
+              <w:t xml:space="preserve">' role. Enabled only for a revertible rejected application with no request already pending. It initiates the revert request for the selected application.</w:t>
             </w:r>
           </w:p>
         </w:tc>
@@ -11656,40 +11594,18 @@
                 <w:sz w:val="21"/>
                 <w:szCs w:val="21"/>
               </w:rPr>
-              <w:t xml:space="preserve">Four new permission entries:</w:t>
-            </w:r>
-            <w:r>
-              <w:rPr>
-                <w:rFonts w:ascii="Arial" w:cs="Arial" w:eastAsia="Arial" w:hAnsi="Arial"/>
-                <w:b w:val="false"/>
-                <w:bCs w:val="false"/>
-                <w:color w:val="000000"/>
-                <w:sz w:val="21"/>
-                <w:szCs w:val="21"/>
-              </w:rPr>
-              <w:t xml:space="preserve"> [CC]/[PL] × 'Revert Application' (per product, Enquiry &gt; Application Enquiry) </w:t>
-            </w:r>
-            <w:r>
-              <w:rPr>
-                <w:rFonts w:ascii="Arial" w:cs="Arial" w:eastAsia="Arial" w:hAnsi="Arial"/>
-                <w:b w:val="false"/>
-                <w:bCs w:val="false"/>
-                <w:color w:val="6554C0"/>
-                <w:sz w:val="21"/>
-                <w:szCs w:val="21"/>
-              </w:rPr>
-              <w:t xml:space="preserve">plus 'View Application' and 'Evaluate Application' on the Revert Queue (Manually Queue) — product-agnostic, one permission each across CC and PL</w:t>
-            </w:r>
-            <w:r>
-              <w:rPr>
-                <w:rFonts w:ascii="Arial" w:cs="Arial" w:eastAsia="Arial" w:hAnsi="Arial"/>
-                <w:b w:val="false"/>
-                <w:bCs w:val="false"/>
-                <w:color w:val="000000"/>
-                <w:sz w:val="21"/>
-                <w:szCs w:val="21"/>
-              </w:rPr>
-              <w:t xml:space="preserve">. Each is a distinct right — bundling permissions that cover different actions has previously required production hotfixes. The Permission Matrix reference page must be updated.</w:t>
+              <w:t xml:space="preserve">Three new permission entries — 'Revert Application' (Enquiry &gt; Application Enquiry), plus 'View Application' and 'Evaluate Application' on the Revert Queue (Manually Queue). All three are product-agnostic: a single permission each across CC and PL, matching the existing permission layout.</w:t>
+            </w:r>
+            <w:r>
+              <w:rPr>
+                <w:rFonts w:ascii="Arial" w:cs="Arial" w:eastAsia="Arial" w:hAnsi="Arial"/>
+                <w:b w:val="false"/>
+                <w:bCs w:val="false"/>
+                <w:color w:val="000000"/>
+                <w:sz w:val="21"/>
+                <w:szCs w:val="21"/>
+              </w:rPr>
+              <w:t xml:space="preserve"> Each is a distinct right — bundling permissions that cover different actions has previously required production hotfixes. The Permission Matrix reference page must be updated.</w:t>
             </w:r>
           </w:p>
         </w:tc>

</xml_diff>

<commit_message>
Reporting/MIS per PO position: covered by existing Report Enquiry, Approved Transactions gains revert fields
- New BRD impact row (purple) with real Report Enquiry capture: Revert Reason, Repeated Reverts, Updated (latest) Rejection Reason added to the existing Approved Transactions report
- Exceptions via existing Exception Report; root-cause trends = team analysis, not a report output; SLA/TAT deferred to Queue Assignment product upgrade
- Repo US Reporting/MIS row aligned; ia_report.png asset added (Approved Transactions highlighted)

Co-Authored-By: Claude Fable 5 <noreply@anthropic.com>
Claude-Session: https://claude.ai/code/session_01GMyQEZm7CauvpgScBFz4Cf
</commit_message>
<xml_diff>
--- a/docs/brd/Appro_RF_Application_Revert_in_Super_Portal_v1.1.docx
+++ b/docs/brd/Appro_RF_Application_Revert_in_Super_Portal_v1.1.docx
@@ -12311,6 +12311,241 @@
                 <w:szCs w:val="17"/>
               </w:rPr>
               <w:t xml:space="preserve">Communication Setup › Email Templates — Type: Client / Bank</w:t>
+            </w:r>
+          </w:p>
+        </w:tc>
+      </w:tr>
+      <w:tr>
+        <w:trPr>
+          <w:cantSplit/>
+        </w:trPr>
+        <w:tc>
+          <w:tcPr>
+            <w:tcW w:type="dxa" w:w="1715"/>
+            <w:shd w:fill="FFFFFF" w:color="auto" w:val="clear"/>
+            <w:tcMar>
+              <w:top w:type="dxa" w:w="90"/>
+              <w:left w:type="dxa" w:w="110"/>
+              <w:bottom w:type="dxa" w:w="90"/>
+              <w:right w:type="dxa" w:w="110"/>
+            </w:tcMar>
+            <w:vAlign w:val="top"/>
+          </w:tcPr>
+          <w:p>
+            <w:pPr>
+              <w:spacing w:after="0" w:before="0" w:line="252"/>
+            </w:pPr>
+            <w:r>
+              <w:rPr>
+                <w:rFonts w:ascii="Arial" w:cs="Arial" w:eastAsia="Arial" w:hAnsi="Arial"/>
+                <w:b w:val="false"/>
+                <w:bCs w:val="false"/>
+                <w:color w:val="000000"/>
+                <w:sz w:val="21"/>
+                <w:szCs w:val="21"/>
+              </w:rPr>
+              <w:t xml:space="preserve">Reporting / MIS (Report Enquiry)</w:t>
+            </w:r>
+          </w:p>
+        </w:tc>
+        <w:tc>
+          <w:tcPr>
+            <w:tcW w:type="dxa" w:w="4062"/>
+            <w:shd w:fill="FFFFFF" w:color="auto" w:val="clear"/>
+            <w:tcMar>
+              <w:top w:type="dxa" w:w="90"/>
+              <w:left w:type="dxa" w:w="110"/>
+              <w:bottom w:type="dxa" w:w="90"/>
+              <w:right w:type="dxa" w:w="110"/>
+            </w:tcMar>
+            <w:vAlign w:val="top"/>
+          </w:tcPr>
+          <w:p>
+            <w:pPr>
+              <w:spacing w:after="0" w:before="0" w:line="252"/>
+            </w:pPr>
+            <w:r>
+              <w:rPr>
+                <w:rFonts w:ascii="Arial" w:cs="Arial" w:eastAsia="Arial" w:hAnsi="Arial"/>
+                <w:b/>
+                <w:bCs/>
+                <w:color w:val="6554C0"/>
+                <w:sz w:val="21"/>
+                <w:szCs w:val="21"/>
+              </w:rPr>
+              <w:t xml:space="preserve">Covered by the existing Report Enquiry module.</w:t>
+            </w:r>
+            <w:r>
+              <w:rPr>
+                <w:rFonts w:ascii="Arial" w:cs="Arial" w:eastAsia="Arial" w:hAnsi="Arial"/>
+                <w:b w:val="false"/>
+                <w:bCs w:val="false"/>
+                <w:color w:val="6554C0"/>
+                <w:sz w:val="21"/>
+                <w:szCs w:val="21"/>
+              </w:rPr>
+              <w:t xml:space="preserve"> Within this scope, the existing </w:t>
+            </w:r>
+            <w:r>
+              <w:rPr>
+                <w:rFonts w:ascii="Arial" w:cs="Arial" w:eastAsia="Arial" w:hAnsi="Arial"/>
+                <w:b/>
+                <w:bCs/>
+                <w:color w:val="6554C0"/>
+                <w:sz w:val="21"/>
+                <w:szCs w:val="21"/>
+              </w:rPr>
+              <w:t xml:space="preserve">Approved Transactions</w:t>
+            </w:r>
+            <w:r>
+              <w:rPr>
+                <w:rFonts w:ascii="Arial" w:cs="Arial" w:eastAsia="Arial" w:hAnsi="Arial"/>
+                <w:b w:val="false"/>
+                <w:bCs w:val="false"/>
+                <w:color w:val="6554C0"/>
+                <w:sz w:val="21"/>
+                <w:szCs w:val="21"/>
+              </w:rPr>
+              <w:t xml:space="preserve"> report gains the revert fields: </w:t>
+            </w:r>
+            <w:r>
+              <w:rPr>
+                <w:rFonts w:ascii="Arial" w:cs="Arial" w:eastAsia="Arial" w:hAnsi="Arial"/>
+                <w:b/>
+                <w:bCs/>
+                <w:color w:val="6554C0"/>
+                <w:sz w:val="21"/>
+                <w:szCs w:val="21"/>
+              </w:rPr>
+              <w:t xml:space="preserve">Revert Reason</w:t>
+            </w:r>
+            <w:r>
+              <w:rPr>
+                <w:rFonts w:ascii="Arial" w:cs="Arial" w:eastAsia="Arial" w:hAnsi="Arial"/>
+                <w:b w:val="false"/>
+                <w:bCs w:val="false"/>
+                <w:color w:val="6554C0"/>
+                <w:sz w:val="21"/>
+                <w:szCs w:val="21"/>
+              </w:rPr>
+              <w:t xml:space="preserve">, </w:t>
+            </w:r>
+            <w:r>
+              <w:rPr>
+                <w:rFonts w:ascii="Arial" w:cs="Arial" w:eastAsia="Arial" w:hAnsi="Arial"/>
+                <w:b/>
+                <w:bCs/>
+                <w:color w:val="6554C0"/>
+                <w:sz w:val="21"/>
+                <w:szCs w:val="21"/>
+              </w:rPr>
+              <w:t xml:space="preserve">Repeated Reverts</w:t>
+            </w:r>
+            <w:r>
+              <w:rPr>
+                <w:rFonts w:ascii="Arial" w:cs="Arial" w:eastAsia="Arial" w:hAnsi="Arial"/>
+                <w:b w:val="false"/>
+                <w:bCs w:val="false"/>
+                <w:color w:val="6554C0"/>
+                <w:sz w:val="21"/>
+                <w:szCs w:val="21"/>
+              </w:rPr>
+              <w:t xml:space="preserve"> (number of revert cycles) and </w:t>
+            </w:r>
+            <w:r>
+              <w:rPr>
+                <w:rFonts w:ascii="Arial" w:cs="Arial" w:eastAsia="Arial" w:hAnsi="Arial"/>
+                <w:b/>
+                <w:bCs/>
+                <w:color w:val="6554C0"/>
+                <w:sz w:val="21"/>
+                <w:szCs w:val="21"/>
+              </w:rPr>
+              <w:t xml:space="preserve">Updated (latest) Rejection Reason</w:t>
+            </w:r>
+            <w:r>
+              <w:rPr>
+                <w:rFonts w:ascii="Arial" w:cs="Arial" w:eastAsia="Arial" w:hAnsi="Arial"/>
+                <w:b w:val="false"/>
+                <w:bCs w:val="false"/>
+                <w:color w:val="6554C0"/>
+                <w:sz w:val="21"/>
+                <w:szCs w:val="21"/>
+              </w:rPr>
+              <w:t xml:space="preserve">. Exceptions are already served by the existing Exception Report. Root-cause trend analysis is performed by the team from the report data — it is not a system output. SLA achievement / turnaround time reporting is not part of this feature — it follows later with the Queue Assignment product upgrade. Reopened cases must remain consistent in the existing reports (no double-counting in E2E).</w:t>
+            </w:r>
+          </w:p>
+        </w:tc>
+        <w:tc>
+          <w:tcPr>
+            <w:tcW w:type="dxa" w:w="3249"/>
+            <w:tcMar>
+              <w:top w:type="dxa" w:w="90"/>
+              <w:left w:type="dxa" w:w="110"/>
+              <w:bottom w:type="dxa" w:w="90"/>
+              <w:right w:type="dxa" w:w="110"/>
+            </w:tcMar>
+            <w:vAlign w:val="center"/>
+          </w:tcPr>
+          <w:p>
+            <w:pPr>
+              <w:spacing w:after="40" w:before="0"/>
+              <w:jc w:val="center"/>
+            </w:pPr>
+            <w:r>
+              <w:drawing>
+                <wp:inline distT="0" distB="0" distL="0" distR="0">
+                  <wp:extent cx="1809750" cy="1485900"/>
+                  <wp:effectExtent t="0" r="0" b="0" l="0"/>
+                  <wp:docPr id="1" name="" descr="" title=""/>
+                  <wp:cNvGraphicFramePr>
+                    <a:graphicFrameLocks xmlns:a="http://schemas.openxmlformats.org/drawingml/2006/main" noChangeAspect="1"/>
+                  </wp:cNvGraphicFramePr>
+                  <a:graphic xmlns:a="http://schemas.openxmlformats.org/drawingml/2006/main">
+                    <a:graphicData uri="http://schemas.openxmlformats.org/drawingml/2006/picture">
+                      <pic:pic xmlns:pic="http://schemas.openxmlformats.org/drawingml/2006/picture">
+                        <pic:nvPicPr>
+                          <pic:cNvPr id="0" name="" descr=""/>
+                          <pic:cNvPicPr>
+                            <a:picLocks noChangeAspect="1" noChangeArrowheads="1"/>
+                          </pic:cNvPicPr>
+                        </pic:nvPicPr>
+                        <pic:blipFill>
+                          <a:blip r:embed="rId26" cstate="none"/>
+                          <a:srcRect/>
+                          <a:stretch>
+                            <a:fillRect/>
+                          </a:stretch>
+                        </pic:blipFill>
+                        <pic:spPr bwMode="auto">
+                          <a:xfrm>
+                            <a:off x="0" y="0"/>
+                            <a:ext cx="1809750" cy="1485900"/>
+                          </a:xfrm>
+                          <a:prstGeom prst="rect">
+                            <a:avLst/>
+                          </a:prstGeom>
+                        </pic:spPr>
+                      </pic:pic>
+                    </a:graphicData>
+                  </a:graphic>
+                </wp:inline>
+              </w:drawing>
+            </w:r>
+          </w:p>
+          <w:p>
+            <w:pPr>
+              <w:spacing w:after="0" w:before="0"/>
+              <w:jc w:val="center"/>
+            </w:pPr>
+            <w:r>
+              <w:rPr>
+                <w:rFonts w:ascii="Arial" w:cs="Arial" w:eastAsia="Arial" w:hAnsi="Arial"/>
+                <w:color w:val="595959"/>
+                <w:sz w:val="17"/>
+                <w:szCs w:val="17"/>
+              </w:rPr>
+              <w:t xml:space="preserve">Report Enquiry › Report Type — Approved Transactions</w:t>
             </w:r>
           </w:p>
         </w:tc>

</xml_diff>

<commit_message>
Revert triggers nothing: no RE/Limit Assignment re-run on revert (PO correction)
- 4.6: reverting does not trigger AECB, FTS, or Rule Engine / Limit Assignment re-run; previously captured data and results remain unchanged back in Credit Queue
- Versioning bullet scoped to re-runs triggered by Credit user rework under existing behaviour
- Overview bullet, section 5 cross-reference and summary row 4 aligned

Co-Authored-By: Claude Fable 5 <noreply@anthropic.com>
Claude-Session: https://claude.ai/code/session_01GMyQEZm7CauvpgScBFz4Cf
</commit_message>
<xml_diff>
--- a/docs/brd/Appro_RF_Application_Revert_in_Super_Portal_v1.1.docx
+++ b/docs/brd/Appro_RF_Application_Revert_in_Super_Portal_v1.1.docx
@@ -572,7 +572,7 @@
           <w:sz w:val="22"/>
           <w:szCs w:val="22"/>
         </w:rPr>
-        <w:t xml:space="preserve">without triggering a new AECB enquiry or FTS request</w:t>
+        <w:t xml:space="preserve">without triggering a new AECB enquiry, FTS request or Rule Engine / Limit Assignment re-run</w:t>
       </w:r>
       <w:r>
         <w:rPr>
@@ -583,7 +583,7 @@
           <w:sz w:val="22"/>
           <w:szCs w:val="22"/>
         </w:rPr>
-        <w:t xml:space="preserve">. The same application may be reverted more than once, and every revert cycle is maintained in the audit trail (sections 4.6 and 4.7).</w:t>
+        <w:t xml:space="preserve">: the previously captured application data remains unchanged. The same application may be reverted more than once, and every revert cycle is maintained in the audit trail (sections 4.6 and 4.7).</w:t>
       </w:r>
     </w:p>
     <w:p>
@@ -7587,7 +7587,7 @@
           <w:sz w:val="22"/>
           <w:szCs w:val="22"/>
         </w:rPr>
-        <w:t xml:space="preserve">No external re-triggers:</w:t>
+        <w:t xml:space="preserve">No external or system re-triggers:</w:t>
       </w:r>
       <w:r>
         <w:rPr>
@@ -7598,7 +7598,7 @@
           <w:sz w:val="22"/>
           <w:szCs w:val="22"/>
         </w:rPr>
-        <w:t xml:space="preserve"> reverting or reworking the case does </w:t>
+        <w:t xml:space="preserve"> reverting a case does </w:t>
       </w:r>
       <w:r>
         <w:rPr>
@@ -7620,7 +7620,7 @@
           <w:sz w:val="22"/>
           <w:szCs w:val="22"/>
         </w:rPr>
-        <w:t xml:space="preserve"> trigger a new AECB enquiry and does </w:t>
+        <w:t xml:space="preserve"> trigger a new AECB enquiry, a new FTS request, or a </w:t>
       </w:r>
       <w:r>
         <w:rPr>
@@ -7631,7 +7631,7 @@
           <w:sz w:val="22"/>
           <w:szCs w:val="22"/>
         </w:rPr>
-        <w:t xml:space="preserve">not</w:t>
+        <w:t xml:space="preserve">Rule Engine / Limit Assignment re-run</w:t>
       </w:r>
       <w:r>
         <w:rPr>
@@ -7642,7 +7642,7 @@
           <w:sz w:val="22"/>
           <w:szCs w:val="22"/>
         </w:rPr>
-        <w:t xml:space="preserve"> trigger a new FTS request. The re-assessment re-runs the </w:t>
+        <w:t xml:space="preserve">. The previously captured application data and results remain </w:t>
       </w:r>
       <w:r>
         <w:rPr>
@@ -7653,7 +7653,7 @@
           <w:sz w:val="22"/>
           <w:szCs w:val="22"/>
         </w:rPr>
-        <w:t xml:space="preserve">Rule Engine (segmentation / strategy evaluation), DBR calculation, Limit Assignment and eligibility checks</w:t>
+        <w:t xml:space="preserve">unchanged</w:t>
       </w:r>
       <w:r>
         <w:rPr>
@@ -7664,7 +7664,7 @@
           <w:sz w:val="22"/>
           <w:szCs w:val="22"/>
         </w:rPr>
-        <w:t xml:space="preserve"> on the data already held against the application. Where the validity of a data item has expired, the refresh approach is agreed with Credit/Risk — no external call is fired automatically by the revert.</w:t>
+        <w:t xml:space="preserve"> when the application is reverted back to Credit Queue — the Credit user reworks the case on the data as it stands. Where the validity of a data item has expired, the refresh approach is agreed with Credit/Risk — no external call is fired automatically by the revert.</w:t>
       </w:r>
     </w:p>
     <w:p>
@@ -7696,7 +7696,7 @@
           <w:sz w:val="22"/>
           <w:szCs w:val="22"/>
         </w:rPr>
-        <w:t xml:space="preserve"> the re-assessment evaluates against the currently published strategy, score-check and income-multiplier versions, and the applied versions are recorded in the audit trail. Parameter edits made in Credit Queue remain audit-trailed under the existing Credit Queue behaviour (before/after values).</w:t>
+        <w:t xml:space="preserve"> where the Credit user’s rework triggers a re-run under the existing Credit Queue behaviour (e.g. a parameter edit), it evaluates against the currently published strategy, score-check and income-multiplier versions, with the applied versions recorded in the audit trail. Parameter edits made in Credit Queue remain audit-trailed under the existing Credit Queue behaviour (before/after values).</w:t>
       </w:r>
     </w:p>
     <w:p>
@@ -9383,7 +9383,7 @@
           <w:sz w:val="22"/>
           <w:szCs w:val="22"/>
         </w:rPr>
-        <w:t xml:space="preserve">No external re-triggers on re-assessment.</w:t>
+        <w:t xml:space="preserve">No re-triggers on revert.</w:t>
       </w:r>
       <w:r>
         <w:rPr>
@@ -9394,7 +9394,7 @@
           <w:sz w:val="22"/>
           <w:szCs w:val="22"/>
         </w:rPr>
-        <w:t xml:space="preserve"> The post-revert re-assessment re-runs the Rule Engine, DBR calculation and Limit Assignment on the data already held — reverting or reworking a case does not fire a new AECB enquiry or FTS request (section 4.6).</w:t>
+        <w:t xml:space="preserve"> An approved revert returns the application to Credit Queue with its previously captured data and results unchanged — no AECB enquiry, FTS request or Rule Engine / Limit Assignment run is fired by the revert (section 4.6).</w:t>
       </w:r>
     </w:p>
     <w:p>
@@ -11324,7 +11324,7 @@
                 <w:sz w:val="21"/>
                 <w:szCs w:val="21"/>
               </w:rPr>
-              <w:t xml:space="preserve"> — no new AECB enquiry or FTS request is triggered</w:t>
+              <w:t xml:space="preserve"> — no AECB enquiry, FTS request or Rule Engine / Limit Assignment re-run is triggered by the revert; the previously captured data remains unchanged</w:t>
             </w:r>
           </w:p>
         </w:tc>

</xml_diff>

<commit_message>
BRD V1.1 final peer-review round: adopt PO's Word edits into the generator
- PO trims adopted: shorter 1 and 4.2 permission wording, 4.6 no-re-triggers bullet in her exact phrasing, reporting cell reduced to the Approved Transactions field change, removal of the self-approval, TAT-confirmation, versioning, atomic-transitions and section-5 cross-reference paragraphs
- Two fixes: deduplicated 4.6 bullet label from her manual paste; restored "30-day ... continues to apply" (X-day/re-apply slip)
- Kept the no-re-run corrections her base predated (overview bullet, summary row 4)

Co-Authored-By: Claude Fable 5 <noreply@anthropic.com>
Claude-Session: https://claude.ai/code/session_01GMyQEZm7CauvpgScBFz4Cf
</commit_message>
<xml_diff>
--- a/docs/brd/Appro_RF_Application_Revert_in_Super_Portal_v1.1.docx
+++ b/docs/brd/Appro_RF_Application_Revert_in_Super_Portal_v1.1.docx
@@ -2486,51 +2486,7 @@
           <w:sz w:val="22"/>
           <w:szCs w:val="22"/>
         </w:rPr>
-        <w:t xml:space="preserve"> sub-module in the Role Management section of the Super Portal — </w:t>
-      </w:r>
-      <w:r>
-        <w:rPr>
-          <w:rFonts w:ascii="Arial" w:cs="Arial" w:eastAsia="Arial" w:hAnsi="Arial"/>
-          <w:b w:val="false"/>
-          <w:bCs w:val="false"/>
-          <w:color w:val="6554C0"/>
-          <w:sz w:val="22"/>
-          <w:szCs w:val="22"/>
-        </w:rPr>
-        <w:t xml:space="preserve">a </w:t>
-      </w:r>
-      <w:r>
-        <w:rPr>
-          <w:rFonts w:ascii="Arial" w:cs="Arial" w:eastAsia="Arial" w:hAnsi="Arial"/>
-          <w:b/>
-          <w:bCs/>
-          <w:color w:val="6554C0"/>
-          <w:sz w:val="22"/>
-          <w:szCs w:val="22"/>
-        </w:rPr>
-        <w:t xml:space="preserve">single permission with no per-product split</w:t>
-      </w:r>
-      <w:r>
-        <w:rPr>
-          <w:rFonts w:ascii="Arial" w:cs="Arial" w:eastAsia="Arial" w:hAnsi="Arial"/>
-          <w:b w:val="false"/>
-          <w:bCs w:val="false"/>
-          <w:color w:val="6554C0"/>
-          <w:sz w:val="22"/>
-          <w:szCs w:val="22"/>
-        </w:rPr>
-        <w:t xml:space="preserve">, alongside the existing 'View Application' and 'Cancel Application' permissions and matching their existing product-agnostic layout</w:t>
-      </w:r>
-      <w:r>
-        <w:rPr>
-          <w:rFonts w:ascii="Arial" w:cs="Arial" w:eastAsia="Arial" w:hAnsi="Arial"/>
-          <w:b w:val="false"/>
-          <w:bCs w:val="false"/>
-          <w:color w:val="000000"/>
-          <w:sz w:val="22"/>
-          <w:szCs w:val="22"/>
-        </w:rPr>
-        <w:t xml:space="preserve">.</w:t>
+        <w:t xml:space="preserve"> sub-module in the Role Management section of the Super Portal.</w:t>
       </w:r>
     </w:p>
     <w:p>
@@ -5485,40 +5441,7 @@
           <w:sz w:val="22"/>
           <w:szCs w:val="22"/>
         </w:rPr>
-        <w:t xml:space="preserve"> — apply to the Revert Queue </w:t>
-      </w:r>
-      <w:r>
-        <w:rPr>
-          <w:rFonts w:ascii="Arial" w:cs="Arial" w:eastAsia="Arial" w:hAnsi="Arial"/>
-          <w:b/>
-          <w:bCs/>
-          <w:color w:val="6554C0"/>
-          <w:sz w:val="22"/>
-          <w:szCs w:val="22"/>
-        </w:rPr>
-        <w:t xml:space="preserve">without a per-product split</w:t>
-      </w:r>
-      <w:r>
-        <w:rPr>
-          <w:rFonts w:ascii="Arial" w:cs="Arial" w:eastAsia="Arial" w:hAnsi="Arial"/>
-          <w:b w:val="false"/>
-          <w:bCs w:val="false"/>
-          <w:color w:val="6554C0"/>
-          <w:sz w:val="22"/>
-          <w:szCs w:val="22"/>
-        </w:rPr>
-        <w:t xml:space="preserve">: each is a single permission covering all applicable products (CC and PL), consistent with the queue listing all products in one view</w:t>
-      </w:r>
-      <w:r>
-        <w:rPr>
-          <w:rFonts w:ascii="Arial" w:cs="Arial" w:eastAsia="Arial" w:hAnsi="Arial"/>
-          <w:b w:val="false"/>
-          <w:bCs w:val="false"/>
-          <w:color w:val="000000"/>
-          <w:sz w:val="22"/>
-          <w:szCs w:val="22"/>
-        </w:rPr>
-        <w:t xml:space="preserve">:</w:t>
+        <w:t xml:space="preserve"> — apply to the Revert Queue.</w:t>
       </w:r>
     </w:p>
     <w:tbl>
@@ -6000,33 +5923,6 @@
         </w:tc>
       </w:tr>
     </w:tbl>
-    <w:p>
-      <w:pPr>
-        <w:spacing w:after="120" w:before="40" w:line="264"/>
-      </w:pPr>
-      <w:r>
-        <w:rPr>
-          <w:rFonts w:ascii="Arial" w:cs="Arial" w:eastAsia="Arial" w:hAnsi="Arial"/>
-          <w:b/>
-          <w:bCs/>
-          <w:color w:val="6554C0"/>
-          <w:sz w:val="22"/>
-          <w:szCs w:val="22"/>
-        </w:rPr>
-        <w:t xml:space="preserve">Maker–checker control — self-approval technically prevented:</w:t>
-      </w:r>
-      <w:r>
-        <w:rPr>
-          <w:rFonts w:ascii="Arial" w:cs="Arial" w:eastAsia="Arial" w:hAnsi="Arial"/>
-          <w:b w:val="false"/>
-          <w:bCs w:val="false"/>
-          <w:color w:val="6554C0"/>
-          <w:sz w:val="22"/>
-          <w:szCs w:val="22"/>
-        </w:rPr>
-        <w:t xml:space="preserve"> the Checker must be a different user from the requester. A user who submitted a revert request cannot approve or reject that same request, even if they hold the Evaluate Application permission — the system blocks the action for the requesting user id.</w:t>
-      </w:r>
-    </w:p>
     <w:p>
       <w:pPr>
         <w:pStyle w:val="Heading2"/>
@@ -7414,66 +7310,6 @@
     </w:tbl>
     <w:p>
       <w:pPr>
-        <w:spacing w:after="120" w:before="40" w:line="264"/>
-      </w:pPr>
-      <w:r>
-        <w:rPr>
-          <w:rFonts w:ascii="Arial" w:cs="Arial" w:eastAsia="Arial" w:hAnsi="Arial"/>
-          <w:b w:val="false"/>
-          <w:bCs w:val="false"/>
-          <w:color w:val="6554C0"/>
-          <w:sz w:val="22"/>
-          <w:szCs w:val="22"/>
-        </w:rPr>
-        <w:t xml:space="preserve">Queue ageing, reminders and escalation for the Revert Queue follow the platform-wide </w:t>
-      </w:r>
-      <w:r>
-        <w:rPr>
-          <w:rFonts w:ascii="Arial" w:cs="Arial" w:eastAsia="Arial" w:hAnsi="Arial"/>
-          <w:b/>
-          <w:bCs/>
-          <w:color w:val="6554C0"/>
-          <w:sz w:val="22"/>
-          <w:szCs w:val="22"/>
-        </w:rPr>
-        <w:t xml:space="preserve">Queue Assignment Management (TAT)</w:t>
-      </w:r>
-      <w:r>
-        <w:rPr>
-          <w:rFonts w:ascii="Arial" w:cs="Arial" w:eastAsia="Arial" w:hAnsi="Arial"/>
-          <w:b w:val="false"/>
-          <w:bCs w:val="false"/>
-          <w:color w:val="6554C0"/>
-          <w:sz w:val="22"/>
-          <w:szCs w:val="22"/>
-        </w:rPr>
-        <w:t xml:space="preserve"> enhancement currently in delivery — the Revert Queue receives its TAT configuration once that capability lands (configuration, not new build). The [X]-day auto-approval behaviour above remains </w:t>
-      </w:r>
-      <w:r>
-        <w:rPr>
-          <w:rFonts w:ascii="Arial" w:cs="Arial" w:eastAsia="Arial" w:hAnsi="Arial"/>
-          <w:b/>
-          <w:bCs/>
-          <w:color w:val="6554C0"/>
-          <w:sz w:val="22"/>
-          <w:szCs w:val="22"/>
-        </w:rPr>
-        <w:t xml:space="preserve">subject to Credit/Risk confirmation</w:t>
-      </w:r>
-      <w:r>
-        <w:rPr>
-          <w:rFonts w:ascii="Arial" w:cs="Arial" w:eastAsia="Arial" w:hAnsi="Arial"/>
-          <w:b w:val="false"/>
-          <w:bCs w:val="false"/>
-          <w:color w:val="6554C0"/>
-          <w:sz w:val="22"/>
-          <w:szCs w:val="22"/>
-        </w:rPr>
-        <w:t xml:space="preserve">; should Credit/Risk prefer no auto-action or an auto-expiry of the request on timeout, this section will be revised accordingly.</w:t>
-      </w:r>
-    </w:p>
-    <w:p>
-      <w:pPr>
         <w:pStyle w:val="Heading2"/>
         <w:spacing w:after="120" w:before="240"/>
       </w:pPr>
@@ -7664,7 +7500,24 @@
           <w:sz w:val="22"/>
           <w:szCs w:val="22"/>
         </w:rPr>
-        <w:t xml:space="preserve"> when the application is reverted back to Credit Queue — the Credit user reworks the case on the data as it stands. Where the validity of a data item has expired, the refresh approach is agreed with Credit/Risk — no external call is fired automatically by the revert.</w:t>
+        <w:t xml:space="preserve"> when the application is reverted back to Credit Queue — the Credit user reworks the case on the data as it stands.</w:t>
+      </w:r>
+    </w:p>
+    <w:p>
+      <w:pPr>
+        <w:pStyle w:val="Heading2"/>
+        <w:spacing w:after="120" w:before="240"/>
+      </w:pPr>
+      <w:r>
+        <w:rPr>
+          <w:rFonts w:ascii="Arial" w:cs="Arial" w:eastAsia="Arial" w:hAnsi="Arial"/>
+          <w:b/>
+          <w:bCs/>
+          <w:color w:val="000000"/>
+          <w:sz w:val="22"/>
+          <w:szCs w:val="22"/>
+        </w:rPr>
+        <w:t xml:space="preserve">4.7 Multiple reverts</w:t>
       </w:r>
     </w:p>
     <w:p>
@@ -7679,13 +7532,24 @@
       <w:r>
         <w:rPr>
           <w:rFonts w:ascii="Arial" w:cs="Arial" w:eastAsia="Arial" w:hAnsi="Arial"/>
+          <w:b w:val="false"/>
+          <w:bCs w:val="false"/>
+          <w:color w:val="6554C0"/>
+          <w:sz w:val="22"/>
+          <w:szCs w:val="22"/>
+        </w:rPr>
+        <w:t xml:space="preserve">The same application </w:t>
+      </w:r>
+      <w:r>
+        <w:rPr>
+          <w:rFonts w:ascii="Arial" w:cs="Arial" w:eastAsia="Arial" w:hAnsi="Arial"/>
           <w:b/>
           <w:bCs/>
           <w:color w:val="6554C0"/>
           <w:sz w:val="22"/>
           <w:szCs w:val="22"/>
         </w:rPr>
-        <w:t xml:space="preserve">Versioning and edit audit:</w:t>
+        <w:t xml:space="preserve">can be reverted more than once</w:t>
       </w:r>
       <w:r>
         <w:rPr>
@@ -7696,24 +7560,7 @@
           <w:sz w:val="22"/>
           <w:szCs w:val="22"/>
         </w:rPr>
-        <w:t xml:space="preserve"> where the Credit user’s rework triggers a re-run under the existing Credit Queue behaviour (e.g. a parameter edit), it evaluates against the currently published strategy, score-check and income-multiplier versions, with the applied versions recorded in the audit trail. Parameter edits made in Credit Queue remain audit-trailed under the existing Credit Queue behaviour (before/after values).</w:t>
-      </w:r>
-    </w:p>
-    <w:p>
-      <w:pPr>
-        <w:pStyle w:val="Heading2"/>
-        <w:spacing w:after="120" w:before="240"/>
-      </w:pPr>
-      <w:r>
-        <w:rPr>
-          <w:rFonts w:ascii="Arial" w:cs="Arial" w:eastAsia="Arial" w:hAnsi="Arial"/>
-          <w:b/>
-          <w:bCs/>
-          <w:color w:val="000000"/>
-          <w:sz w:val="22"/>
-          <w:szCs w:val="22"/>
-        </w:rPr>
-        <w:t xml:space="preserve">4.7 Multiple reverts</w:t>
+        <w:t xml:space="preserve"> — no cap applies to the number of reverts per application in this version.</w:t>
       </w:r>
     </w:p>
     <w:p>
@@ -7728,24 +7575,13 @@
       <w:r>
         <w:rPr>
           <w:rFonts w:ascii="Arial" w:cs="Arial" w:eastAsia="Arial" w:hAnsi="Arial"/>
-          <w:b w:val="false"/>
-          <w:bCs w:val="false"/>
-          <w:color w:val="6554C0"/>
-          <w:sz w:val="22"/>
-          <w:szCs w:val="22"/>
-        </w:rPr>
-        <w:t xml:space="preserve">The same application </w:t>
-      </w:r>
-      <w:r>
-        <w:rPr>
-          <w:rFonts w:ascii="Arial" w:cs="Arial" w:eastAsia="Arial" w:hAnsi="Arial"/>
           <w:b/>
           <w:bCs/>
           <w:color w:val="6554C0"/>
           <w:sz w:val="22"/>
           <w:szCs w:val="22"/>
         </w:rPr>
-        <w:t xml:space="preserve">can be reverted more than once</w:t>
+        <w:t xml:space="preserve">Each revert is maintained in the audit trail:</w:t>
       </w:r>
       <w:r>
         <w:rPr>
@@ -7756,88 +7592,24 @@
           <w:sz w:val="22"/>
           <w:szCs w:val="22"/>
         </w:rPr>
-        <w:t xml:space="preserve"> — no cap applies to the number of reverts per application in this version.</w:t>
+        <w:t xml:space="preserve"> every revert cycle writes its own complete audit set — initiation ('Manually initiate revert'), the Checker decision ('Revert Queue') or the timeout ('Auto Revert Approval on timeout'), and the outcome. The original rejection record is never modified, so the full history of every revert remains visible in the application history in chronological order.</w:t>
       </w:r>
     </w:p>
     <w:p>
       <w:pPr>
-        <w:pStyle w:val="ListParagraph"/>
-        <w:numPr>
-          <w:ilvl w:val="0"/>
-          <w:numId w:val="1"/>
-        </w:numPr>
-        <w:spacing w:after="80" w:before="30" w:line="264"/>
+        <w:pStyle w:val="Heading2"/>
+        <w:spacing w:after="120" w:before="240"/>
       </w:pPr>
       <w:r>
         <w:rPr>
           <w:rFonts w:ascii="Arial" w:cs="Arial" w:eastAsia="Arial" w:hAnsi="Arial"/>
           <w:b/>
           <w:bCs/>
-          <w:color w:val="6554C0"/>
-          <w:sz w:val="22"/>
-          <w:szCs w:val="22"/>
-        </w:rPr>
-        <w:t xml:space="preserve">Each revert is maintained in the audit trail:</w:t>
-      </w:r>
-      <w:r>
-        <w:rPr>
-          <w:rFonts w:ascii="Arial" w:cs="Arial" w:eastAsia="Arial" w:hAnsi="Arial"/>
-          <w:b w:val="false"/>
-          <w:bCs w:val="false"/>
-          <w:color w:val="6554C0"/>
-          <w:sz w:val="22"/>
-          <w:szCs w:val="22"/>
-        </w:rPr>
-        <w:t xml:space="preserve"> every revert cycle writes its own complete audit set — initiation ('Manually initiate revert'), the Checker decision ('Revert Queue') or the timeout ('Auto Revert Approval on timeout'), and the outcome. The original rejection record is never modified, so the full history of every revert remains visible in the application history in chronological order.</w:t>
-      </w:r>
-    </w:p>
-    <w:p>
-      <w:pPr>
-        <w:pStyle w:val="Heading2"/>
-        <w:spacing w:after="120" w:before="240"/>
-      </w:pPr>
-      <w:r>
-        <w:rPr>
-          <w:rFonts w:ascii="Arial" w:cs="Arial" w:eastAsia="Arial" w:hAnsi="Arial"/>
-          <w:b/>
-          <w:bCs/>
           <w:color w:val="000000"/>
           <w:sz w:val="22"/>
           <w:szCs w:val="22"/>
         </w:rPr>
         <w:t xml:space="preserve">4.8 Exception handling and duplicate prevention</w:t>
-      </w:r>
-    </w:p>
-    <w:p>
-      <w:pPr>
-        <w:pStyle w:val="ListParagraph"/>
-        <w:numPr>
-          <w:ilvl w:val="0"/>
-          <w:numId w:val="1"/>
-        </w:numPr>
-        <w:spacing w:after="80" w:before="30" w:line="264"/>
-      </w:pPr>
-      <w:r>
-        <w:rPr>
-          <w:rFonts w:ascii="Arial" w:cs="Arial" w:eastAsia="Arial" w:hAnsi="Arial"/>
-          <w:b/>
-          <w:bCs/>
-          <w:color w:val="6554C0"/>
-          <w:sz w:val="22"/>
-          <w:szCs w:val="22"/>
-        </w:rPr>
-        <w:t xml:space="preserve">Atomic transitions:</w:t>
-      </w:r>
-      <w:r>
-        <w:rPr>
-          <w:rFonts w:ascii="Arial" w:cs="Arial" w:eastAsia="Arial" w:hAnsi="Arial"/>
-          <w:b w:val="false"/>
-          <w:bCs w:val="false"/>
-          <w:color w:val="6554C0"/>
-          <w:sz w:val="22"/>
-          <w:szCs w:val="22"/>
-        </w:rPr>
-        <w:t xml:space="preserve"> if any step of a revert action fails — queue movement, status update, Rule Engine / Limit Assignment run or notification — the application remains in its previous consistent state and the action can be safely retried. No application may remain stuck or partially processed between states.</w:t>
       </w:r>
     </w:p>
     <w:p>
@@ -9368,33 +9140,6 @@
           <w:szCs w:val="22"/>
         </w:rPr>
         <w:t xml:space="preserve"> The “fails all segmentations” and “approved limit &lt; Min Boundary” cases keep their current auto-rejection logic — no parking is introduced for them. A revert of such a case returns it to ‘Awaiting Credit Approval’ — Credit Queue L1, where a Credit user takes ownership of the re-decision.</w:t>
-      </w:r>
-    </w:p>
-    <w:p>
-      <w:pPr>
-        <w:spacing w:after="120" w:before="40" w:line="264"/>
-      </w:pPr>
-      <w:r>
-        <w:rPr>
-          <w:rFonts w:ascii="Arial" w:cs="Arial" w:eastAsia="Arial" w:hAnsi="Arial"/>
-          <w:b/>
-          <w:bCs/>
-          <w:color w:val="6554C0"/>
-          <w:sz w:val="22"/>
-          <w:szCs w:val="22"/>
-        </w:rPr>
-        <w:t xml:space="preserve">No re-triggers on revert.</w:t>
-      </w:r>
-      <w:r>
-        <w:rPr>
-          <w:rFonts w:ascii="Arial" w:cs="Arial" w:eastAsia="Arial" w:hAnsi="Arial"/>
-          <w:b w:val="false"/>
-          <w:bCs w:val="false"/>
-          <w:color w:val="6554C0"/>
-          <w:sz w:val="22"/>
-          <w:szCs w:val="22"/>
-        </w:rPr>
-        <w:t xml:space="preserve"> An approved revert returns the application to Credit Queue with its previously captured data and results unchanged — no AECB enquiry, FTS request or Rule Engine / Limit Assignment run is fired by the revert (section 4.6).</w:t>
       </w:r>
     </w:p>
     <w:p>
@@ -12367,13 +12112,24 @@
             <w:r>
               <w:rPr>
                 <w:rFonts w:ascii="Arial" w:cs="Arial" w:eastAsia="Arial" w:hAnsi="Arial"/>
+                <w:b w:val="false"/>
+                <w:bCs w:val="false"/>
+                <w:color w:val="6554C0"/>
+                <w:sz w:val="21"/>
+                <w:szCs w:val="21"/>
+              </w:rPr>
+              <w:t xml:space="preserve">Within this scope, the existing </w:t>
+            </w:r>
+            <w:r>
+              <w:rPr>
+                <w:rFonts w:ascii="Arial" w:cs="Arial" w:eastAsia="Arial" w:hAnsi="Arial"/>
                 <w:b/>
                 <w:bCs/>
                 <w:color w:val="6554C0"/>
                 <w:sz w:val="21"/>
                 <w:szCs w:val="21"/>
               </w:rPr>
-              <w:t xml:space="preserve">Covered by the existing Report Enquiry module.</w:t>
+              <w:t xml:space="preserve">Approved Transactions</w:t>
             </w:r>
             <w:r>
               <w:rPr>
@@ -12384,7 +12140,7 @@
                 <w:sz w:val="21"/>
                 <w:szCs w:val="21"/>
               </w:rPr>
-              <w:t xml:space="preserve"> Within this scope, the existing </w:t>
+              <w:t xml:space="preserve"> report gains the revert fields: </w:t>
             </w:r>
             <w:r>
               <w:rPr>
@@ -12395,7 +12151,7 @@
                 <w:sz w:val="21"/>
                 <w:szCs w:val="21"/>
               </w:rPr>
-              <w:t xml:space="preserve">Approved Transactions</w:t>
+              <w:t xml:space="preserve">Revert Reason</w:t>
             </w:r>
             <w:r>
               <w:rPr>
@@ -12406,7 +12162,7 @@
                 <w:sz w:val="21"/>
                 <w:szCs w:val="21"/>
               </w:rPr>
-              <w:t xml:space="preserve"> report gains the revert fields: </w:t>
+              <w:t xml:space="preserve">, </w:t>
             </w:r>
             <w:r>
               <w:rPr>
@@ -12417,7 +12173,7 @@
                 <w:sz w:val="21"/>
                 <w:szCs w:val="21"/>
               </w:rPr>
-              <w:t xml:space="preserve">Revert Reason</w:t>
+              <w:t xml:space="preserve">Repeated Reverts</w:t>
             </w:r>
             <w:r>
               <w:rPr>
@@ -12428,7 +12184,7 @@
                 <w:sz w:val="21"/>
                 <w:szCs w:val="21"/>
               </w:rPr>
-              <w:t xml:space="preserve">, </w:t>
+              <w:t xml:space="preserve"> (number of revert cycles) and </w:t>
             </w:r>
             <w:r>
               <w:rPr>
@@ -12439,7 +12195,7 @@
                 <w:sz w:val="21"/>
                 <w:szCs w:val="21"/>
               </w:rPr>
-              <w:t xml:space="preserve">Repeated Reverts</w:t>
+              <w:t xml:space="preserve">Updated (latest) Rejection Reason</w:t>
             </w:r>
             <w:r>
               <w:rPr>
@@ -12450,29 +12206,7 @@
                 <w:sz w:val="21"/>
                 <w:szCs w:val="21"/>
               </w:rPr>
-              <w:t xml:space="preserve"> (number of revert cycles) and </w:t>
-            </w:r>
-            <w:r>
-              <w:rPr>
-                <w:rFonts w:ascii="Arial" w:cs="Arial" w:eastAsia="Arial" w:hAnsi="Arial"/>
-                <w:b/>
-                <w:bCs/>
-                <w:color w:val="6554C0"/>
-                <w:sz w:val="21"/>
-                <w:szCs w:val="21"/>
-              </w:rPr>
-              <w:t xml:space="preserve">Updated (latest) Rejection Reason</w:t>
-            </w:r>
-            <w:r>
-              <w:rPr>
-                <w:rFonts w:ascii="Arial" w:cs="Arial" w:eastAsia="Arial" w:hAnsi="Arial"/>
-                <w:b w:val="false"/>
-                <w:bCs w:val="false"/>
-                <w:color w:val="6554C0"/>
-                <w:sz w:val="21"/>
-                <w:szCs w:val="21"/>
-              </w:rPr>
-              <w:t xml:space="preserve">. Exceptions are already served by the existing Exception Report. Root-cause trend analysis is performed by the team from the report data — it is not a system output. SLA achievement / turnaround time reporting is not part of this feature — it follows later with the Queue Assignment product upgrade. Reopened cases must remain consistent in the existing reports (no double-counting in E2E).</w:t>
+              <w:t xml:space="preserve">.</w:t>
             </w:r>
           </w:p>
         </w:tc>

</xml_diff>